<commit_message>
Deploy sikkoo build from ea2560168a9fe161cb0f08b4e1249303a5344fa2 naolk35/doc-generator-app@ea2560168a9fe161cb0f08b4e1249303a5344fa2
</commit_message>
<xml_diff>
--- a/DhaabbataLeenjii.docx
+++ b/DhaabbataLeenjii.docx
@@ -575,14 +575,12 @@
           </mc:Fallback>
         </mc:AlternateContent>
       </w:r>
-      <w:proofErr w:type="spellStart"/>
       <w:r>
         <w:rPr>
           <w:color w:val="0000FF"/>
         </w:rPr>
         <w:t>Ragaa</w:t>
       </w:r>
-      <w:proofErr w:type="spellEnd"/>
       <w:r>
         <w:rPr>
           <w:color w:val="0000FF"/>
@@ -590,14 +588,12 @@
         </w:rPr>
         <w:t xml:space="preserve"> </w:t>
       </w:r>
-      <w:proofErr w:type="spellStart"/>
       <w:r>
         <w:rPr>
           <w:color w:val="0000FF"/>
         </w:rPr>
         <w:t>Xumuraa</w:t>
       </w:r>
-      <w:proofErr w:type="spellEnd"/>
       <w:r>
         <w:rPr>
           <w:color w:val="0000FF"/>
@@ -605,7 +601,6 @@
         </w:rPr>
         <w:t xml:space="preserve"> </w:t>
       </w:r>
-      <w:proofErr w:type="spellStart"/>
       <w:r>
         <w:rPr>
           <w:color w:val="0000FF"/>
@@ -613,7 +608,6 @@
         </w:rPr>
         <w:t>Leenjii</w:t>
       </w:r>
-      <w:proofErr w:type="spellEnd"/>
     </w:p>
     <w:p>
       <w:pPr>
@@ -626,20 +620,9 @@
         <w:ind w:left="72"/>
         <w:jc w:val="both"/>
       </w:pPr>
-      <w:proofErr w:type="spellStart"/>
-      <w:r>
-        <w:t>Leenjituu</w:t>
-      </w:r>
-      <w:proofErr w:type="spellEnd"/>
-      <w:r>
-        <w:t>/</w:t>
-      </w:r>
-      <w:proofErr w:type="spellStart"/>
-      <w:proofErr w:type="gramStart"/>
-      <w:r>
-        <w:t>Ji’aa</w:t>
-      </w:r>
-      <w:proofErr w:type="spellEnd"/>
+      <w:r>
+        <w:t>Leenjituu/Ji’aa</w:t>
+      </w:r>
       <w:r>
         <w:rPr>
           <w:spacing w:val="366"/>
@@ -650,109 +633,42 @@
         <w:rPr>
           <w:u w:val="single"/>
         </w:rPr>
-        <w:t xml:space="preserve"> {</w:t>
-      </w:r>
-      <w:proofErr w:type="spellStart"/>
-      <w:proofErr w:type="gramEnd"/>
-      <w:r>
-        <w:rPr>
+        <w:t xml:space="preserve"> </w:t>
+      </w:r>
+      <w:r>
+        <w:rPr>
+          <w:b/>
           <w:u w:val="single"/>
         </w:rPr>
-        <w:t>fullName</w:t>
-      </w:r>
-      <w:proofErr w:type="spellEnd"/>
+        <w:t>{fullName}</w:t>
+      </w:r>
       <w:r>
         <w:rPr>
           <w:u w:val="single"/>
         </w:rPr>
-        <w:t xml:space="preserve">} </w:t>
-      </w:r>
-      <w:r>
-        <w:t xml:space="preserve"> </w:t>
-      </w:r>
-      <w:proofErr w:type="spellStart"/>
-      <w:r>
-        <w:t>Ogommaa</w:t>
-      </w:r>
-      <w:proofErr w:type="spellEnd"/>
-      <w:r>
-        <w:t xml:space="preserve"> </w:t>
-      </w:r>
-      <w:proofErr w:type="spellStart"/>
-      <w:r>
-        <w:t>Haalaa</w:t>
-      </w:r>
-      <w:proofErr w:type="spellEnd"/>
-      <w:r>
-        <w:t xml:space="preserve"> </w:t>
-      </w:r>
-      <w:proofErr w:type="spellStart"/>
-      <w:r>
-        <w:t>Qabiinsa</w:t>
-      </w:r>
-      <w:proofErr w:type="spellEnd"/>
-      <w:r>
-        <w:t xml:space="preserve"> </w:t>
-      </w:r>
-      <w:proofErr w:type="spellStart"/>
-      <w:r>
-        <w:t>Manaa</w:t>
-      </w:r>
-      <w:proofErr w:type="spellEnd"/>
-      <w:r>
-        <w:t xml:space="preserve"> </w:t>
-      </w:r>
-      <w:proofErr w:type="spellStart"/>
-      <w:r>
-        <w:t>Sikkoo</w:t>
-      </w:r>
-      <w:proofErr w:type="spellEnd"/>
-      <w:r>
-        <w:t xml:space="preserve"> </w:t>
-      </w:r>
-      <w:proofErr w:type="spellStart"/>
-      <w:r>
-        <w:t>Sadarkaa</w:t>
-      </w:r>
-      <w:proofErr w:type="spellEnd"/>
-      <w:r>
-        <w:t xml:space="preserve"> UC-II </w:t>
-      </w:r>
-      <w:proofErr w:type="spellStart"/>
-      <w:r>
-        <w:t>kan</w:t>
-      </w:r>
-      <w:proofErr w:type="spellEnd"/>
-      <w:r>
-        <w:t xml:space="preserve"> </w:t>
-      </w:r>
-      <w:proofErr w:type="spellStart"/>
-      <w:r>
-        <w:t>geessisuu</w:t>
-      </w:r>
-      <w:proofErr w:type="spellEnd"/>
+        <w:t xml:space="preserve"> </w:t>
+      </w:r>
+      <w:r>
+        <w:t xml:space="preserve"> Ogommaa Haalaa Qabiinsa Manaa Sikkoo Sadarkaa UC-II kan geessisuu</w:t>
+      </w:r>
       <w:r>
         <w:rPr>
           <w:spacing w:val="80"/>
         </w:rPr>
         <w:t xml:space="preserve"> </w:t>
       </w:r>
-      <w:proofErr w:type="spellStart"/>
       <w:r>
         <w:t>Danda’u</w:t>
       </w:r>
-      <w:proofErr w:type="spellEnd"/>
       <w:r>
         <w:rPr>
           <w:spacing w:val="80"/>
         </w:rPr>
         <w:t xml:space="preserve">  </w:t>
       </w:r>
-      <w:proofErr w:type="spellStart"/>
       <w:r>
         <w:t>guyyaa</w:t>
       </w:r>
-      <w:proofErr w:type="spellEnd"/>
       <w:r>
         <w:rPr>
           <w:spacing w:val="296"/>
@@ -763,21 +679,20 @@
         <w:rPr>
           <w:u w:val="single"/>
         </w:rPr>
-        <w:t xml:space="preserve"> {</w:t>
-      </w:r>
-      <w:proofErr w:type="spellStart"/>
-      <w:r>
-        <w:rPr>
+        <w:t xml:space="preserve"> </w:t>
+      </w:r>
+      <w:r>
+        <w:rPr>
+          <w:b/>
           <w:u w:val="single"/>
         </w:rPr>
-        <w:t>firstDate</w:t>
-      </w:r>
-      <w:proofErr w:type="spellEnd"/>
+        <w:t>{firstDate}</w:t>
+      </w:r>
       <w:r>
         <w:rPr>
           <w:u w:val="single"/>
         </w:rPr>
-        <w:t xml:space="preserve">} </w:t>
+        <w:t xml:space="preserve"> </w:t>
       </w:r>
       <w:r>
         <w:rPr>
@@ -785,43 +700,32 @@
         </w:rPr>
         <w:t xml:space="preserve">  </w:t>
       </w:r>
-      <w:proofErr w:type="spellStart"/>
       <w:r>
         <w:t>Hanga</w:t>
       </w:r>
-      <w:proofErr w:type="spellEnd"/>
-    </w:p>
-    <w:p>
-      <w:pPr>
-        <w:pStyle w:val="BodyText"/>
-        <w:tabs>
-          <w:tab w:val="left" w:pos="1688"/>
-        </w:tabs>
-        <w:spacing w:before="1" w:line="331" w:lineRule="auto"/>
-        <w:ind w:left="72" w:right="58"/>
-        <w:jc w:val="both"/>
-      </w:pPr>
+      <w:r>
+        <w:t xml:space="preserve"> </w:t>
+      </w:r>
+      <w:bookmarkStart w:id="0" w:name="_GoBack"/>
+      <w:bookmarkEnd w:id="0"/>
       <w:r>
         <w:rPr>
           <w:u w:val="single"/>
         </w:rPr>
-        <w:t xml:space="preserve"> {</w:t>
-      </w:r>
-      <w:proofErr w:type="spellStart"/>
-      <w:proofErr w:type="gramStart"/>
-      <w:r>
-        <w:rPr>
+        <w:t xml:space="preserve"> </w:t>
+      </w:r>
+      <w:r>
+        <w:rPr>
+          <w:b/>
           <w:u w:val="single"/>
         </w:rPr>
-        <w:t>endDate</w:t>
-      </w:r>
-      <w:proofErr w:type="spellEnd"/>
-      <w:proofErr w:type="gramEnd"/>
+        <w:t>{endDate}</w:t>
+      </w:r>
       <w:r>
         <w:rPr>
           <w:u w:val="single"/>
         </w:rPr>
-        <w:t xml:space="preserve">} </w:t>
+        <w:t xml:space="preserve"> </w:t>
       </w:r>
       <w:r>
         <w:rPr>
@@ -829,73 +733,14 @@
         </w:rPr>
         <w:t xml:space="preserve"> </w:t>
       </w:r>
-      <w:proofErr w:type="spellStart"/>
-      <w:r>
-        <w:t>sagantaa</w:t>
-      </w:r>
-      <w:proofErr w:type="spellEnd"/>
-      <w:r>
-        <w:t xml:space="preserve"> </w:t>
-      </w:r>
-      <w:proofErr w:type="spellStart"/>
-      <w:r>
-        <w:t>idileetiin</w:t>
-      </w:r>
-      <w:proofErr w:type="spellEnd"/>
-      <w:r>
-        <w:t xml:space="preserve"> </w:t>
-      </w:r>
-      <w:proofErr w:type="spellStart"/>
-      <w:r>
-        <w:t>Leenjii</w:t>
-      </w:r>
-      <w:proofErr w:type="spellEnd"/>
-      <w:r>
-        <w:t xml:space="preserve"> </w:t>
-      </w:r>
-      <w:proofErr w:type="spellStart"/>
-      <w:r>
-        <w:t>Hordofuun</w:t>
-      </w:r>
-      <w:proofErr w:type="spellEnd"/>
-      <w:r>
-        <w:t xml:space="preserve"> </w:t>
-      </w:r>
-      <w:proofErr w:type="spellStart"/>
-      <w:r>
-        <w:t>Xumur</w:t>
-      </w:r>
-      <w:proofErr w:type="spellEnd"/>
-      <w:r>
-        <w:t xml:space="preserve">/ </w:t>
-      </w:r>
-      <w:proofErr w:type="spellStart"/>
+      <w:r>
+        <w:t xml:space="preserve">sagantaa idileetiin Leenjii Hordofuun Xumur/ </w:t>
+      </w:r>
       <w:r>
         <w:rPr>
           <w:spacing w:val="-2"/>
         </w:rPr>
-        <w:t>eera</w:t>
-      </w:r>
-      <w:proofErr w:type="spellEnd"/>
-      <w:r>
-        <w:rPr>
-          <w:spacing w:val="-2"/>
-        </w:rPr>
-        <w:t>/</w:t>
-      </w:r>
-      <w:proofErr w:type="spellStart"/>
-      <w:r>
-        <w:rPr>
-          <w:spacing w:val="-2"/>
-        </w:rPr>
-        <w:t>teetti</w:t>
-      </w:r>
-      <w:proofErr w:type="spellEnd"/>
-      <w:r>
-        <w:rPr>
-          <w:spacing w:val="-2"/>
-        </w:rPr>
-        <w:t>.</w:t>
+        <w:t>eera/teetti.</w:t>
       </w:r>
     </w:p>
     <w:p>
@@ -905,235 +750,32 @@
         <w:ind w:left="72" w:right="57" w:firstLine="64"/>
         <w:jc w:val="both"/>
       </w:pPr>
-      <w:proofErr w:type="spellStart"/>
       <w:r>
         <w:rPr>
           <w:b/>
         </w:rPr>
-        <w:t>Hubachiisa</w:t>
-      </w:r>
-      <w:proofErr w:type="spellEnd"/>
-      <w:proofErr w:type="gramStart"/>
-      <w:r>
-        <w:rPr>
-          <w:b/>
-        </w:rPr>
-        <w:t>:-</w:t>
-      </w:r>
-      <w:proofErr w:type="gramEnd"/>
-      <w:r>
-        <w:rPr>
-          <w:b/>
-        </w:rPr>
-        <w:t xml:space="preserve"> </w:t>
-      </w:r>
-      <w:proofErr w:type="spellStart"/>
-      <w:r>
-        <w:t>Ragaan</w:t>
-      </w:r>
-      <w:proofErr w:type="spellEnd"/>
-      <w:r>
-        <w:t xml:space="preserve"> </w:t>
-      </w:r>
-      <w:proofErr w:type="spellStart"/>
-      <w:r>
-        <w:t>kan</w:t>
-      </w:r>
-      <w:proofErr w:type="spellEnd"/>
-      <w:r>
-        <w:t xml:space="preserve"> </w:t>
-      </w:r>
-      <w:proofErr w:type="spellStart"/>
-      <w:r>
-        <w:t>Xumura</w:t>
-      </w:r>
-      <w:proofErr w:type="spellEnd"/>
-      <w:r>
-        <w:t xml:space="preserve"> </w:t>
-      </w:r>
-      <w:proofErr w:type="spellStart"/>
-      <w:r>
-        <w:t>leenjii</w:t>
-      </w:r>
-      <w:proofErr w:type="spellEnd"/>
-      <w:r>
-        <w:t xml:space="preserve"> </w:t>
-      </w:r>
-      <w:proofErr w:type="spellStart"/>
-      <w:r>
-        <w:t>kan</w:t>
-      </w:r>
-      <w:proofErr w:type="spellEnd"/>
-      <w:r>
-        <w:t xml:space="preserve"> </w:t>
-      </w:r>
-      <w:proofErr w:type="spellStart"/>
-      <w:r>
-        <w:t>agarsiisu</w:t>
-      </w:r>
-      <w:proofErr w:type="spellEnd"/>
+        <w:t xml:space="preserve">Hubachiisa:- </w:t>
+      </w:r>
+      <w:r>
+        <w:t>Ragaan kan Xumura leenjii kan agarsiisu</w:t>
+      </w:r>
       <w:r>
         <w:rPr>
           <w:spacing w:val="40"/>
         </w:rPr>
         <w:t xml:space="preserve"> </w:t>
       </w:r>
-      <w:proofErr w:type="spellStart"/>
-      <w:r>
-        <w:t>malee</w:t>
-      </w:r>
-      <w:proofErr w:type="spellEnd"/>
-      <w:r>
-        <w:t xml:space="preserve"> </w:t>
-      </w:r>
-      <w:proofErr w:type="spellStart"/>
-      <w:r>
-        <w:t>mirkaneessaa</w:t>
-      </w:r>
-      <w:proofErr w:type="spellEnd"/>
-      <w:r>
-        <w:t xml:space="preserve"> </w:t>
-      </w:r>
-      <w:proofErr w:type="spellStart"/>
-      <w:r>
-        <w:t>gahumsaatiif</w:t>
-      </w:r>
-      <w:proofErr w:type="spellEnd"/>
-      <w:r>
-        <w:t xml:space="preserve"> </w:t>
-      </w:r>
-      <w:proofErr w:type="spellStart"/>
-      <w:r>
-        <w:t>kan</w:t>
-      </w:r>
-      <w:proofErr w:type="spellEnd"/>
-      <w:r>
-        <w:t xml:space="preserve"> </w:t>
-      </w:r>
-      <w:proofErr w:type="spellStart"/>
-      <w:r>
-        <w:t>tajaajilu</w:t>
-      </w:r>
-      <w:proofErr w:type="spellEnd"/>
-      <w:r>
-        <w:t xml:space="preserve"> </w:t>
-      </w:r>
-      <w:proofErr w:type="spellStart"/>
-      <w:r>
-        <w:t>miti</w:t>
-      </w:r>
-      <w:proofErr w:type="spellEnd"/>
-      <w:r>
-        <w:t xml:space="preserve">. </w:t>
-      </w:r>
-      <w:proofErr w:type="spellStart"/>
-      <w:r>
-        <w:t>Gahumsi</w:t>
-      </w:r>
-      <w:proofErr w:type="spellEnd"/>
+      <w:r>
+        <w:t>malee mirkaneessaa gahumsaatiif kan tajaajilu miti. Gahumsi</w:t>
+      </w:r>
       <w:r>
         <w:rPr>
           <w:spacing w:val="40"/>
         </w:rPr>
         <w:t xml:space="preserve"> </w:t>
       </w:r>
-      <w:proofErr w:type="spellStart"/>
-      <w:r>
-        <w:t>sadarkaa</w:t>
-      </w:r>
-      <w:proofErr w:type="spellEnd"/>
-      <w:r>
-        <w:t xml:space="preserve"> </w:t>
-      </w:r>
-      <w:proofErr w:type="spellStart"/>
-      <w:r>
-        <w:t>Leenjii</w:t>
-      </w:r>
-      <w:proofErr w:type="spellEnd"/>
-      <w:r>
-        <w:t xml:space="preserve"> </w:t>
-      </w:r>
-      <w:proofErr w:type="spellStart"/>
-      <w:r>
-        <w:t>aniin</w:t>
-      </w:r>
-      <w:proofErr w:type="spellEnd"/>
-      <w:r>
-        <w:t xml:space="preserve"> </w:t>
-      </w:r>
-      <w:proofErr w:type="spellStart"/>
-      <w:proofErr w:type="gramStart"/>
-      <w:r>
-        <w:t>kan</w:t>
-      </w:r>
-      <w:proofErr w:type="spellEnd"/>
-      <w:proofErr w:type="gramEnd"/>
-      <w:r>
-        <w:t xml:space="preserve"> </w:t>
-      </w:r>
-      <w:proofErr w:type="spellStart"/>
-      <w:r>
-        <w:t>mirkana’u</w:t>
-      </w:r>
-      <w:proofErr w:type="spellEnd"/>
-      <w:r>
-        <w:t xml:space="preserve"> </w:t>
-      </w:r>
-      <w:proofErr w:type="spellStart"/>
-      <w:r>
-        <w:t>danda’u</w:t>
-      </w:r>
-      <w:proofErr w:type="spellEnd"/>
-      <w:r>
-        <w:t xml:space="preserve"> </w:t>
-      </w:r>
-      <w:proofErr w:type="spellStart"/>
-      <w:r>
-        <w:t>madaalii</w:t>
-      </w:r>
-      <w:proofErr w:type="spellEnd"/>
-      <w:r>
-        <w:t xml:space="preserve"> </w:t>
-      </w:r>
-      <w:proofErr w:type="spellStart"/>
-      <w:r>
-        <w:t>wirtu</w:t>
-      </w:r>
-      <w:proofErr w:type="spellEnd"/>
-      <w:r>
-        <w:t xml:space="preserve"> </w:t>
-      </w:r>
-      <w:proofErr w:type="spellStart"/>
-      <w:r>
-        <w:t>mirkaneessaa</w:t>
-      </w:r>
-      <w:proofErr w:type="spellEnd"/>
-      <w:r>
-        <w:t xml:space="preserve"> </w:t>
-      </w:r>
-      <w:proofErr w:type="spellStart"/>
-      <w:r>
-        <w:t>Gahumsaatiin</w:t>
-      </w:r>
-      <w:proofErr w:type="spellEnd"/>
-      <w:r>
-        <w:t xml:space="preserve"> </w:t>
-      </w:r>
-      <w:proofErr w:type="spellStart"/>
-      <w:r>
-        <w:t>qofa</w:t>
-      </w:r>
-      <w:proofErr w:type="spellEnd"/>
-      <w:r>
-        <w:t xml:space="preserve"> </w:t>
-      </w:r>
-      <w:proofErr w:type="spellStart"/>
-      <w:r>
-        <w:t>ta’a</w:t>
-      </w:r>
-      <w:proofErr w:type="spellEnd"/>
-      <w:r>
-        <w:t>.</w:t>
+      <w:r>
+        <w:t>sadarkaa Leenjii aniin kan mirkana’u danda’u madaalii wirtu mirkaneessaa Gahumsaatiin qofa ta’a.</w:t>
       </w:r>
     </w:p>
     <w:p>
@@ -1152,47 +794,13 @@
           <w:sz w:val="26"/>
         </w:rPr>
       </w:pPr>
-      <w:proofErr w:type="spellStart"/>
       <w:r>
         <w:rPr>
           <w:b/>
           <w:sz w:val="26"/>
         </w:rPr>
-        <w:t>Hogganaa</w:t>
-      </w:r>
-      <w:proofErr w:type="spellEnd"/>
-      <w:r>
-        <w:rPr>
-          <w:b/>
-          <w:sz w:val="26"/>
-        </w:rPr>
-        <w:t xml:space="preserve"> </w:t>
-      </w:r>
-      <w:proofErr w:type="spellStart"/>
-      <w:r>
-        <w:rPr>
-          <w:b/>
-          <w:sz w:val="26"/>
-        </w:rPr>
-        <w:t>Dhaabbataa</w:t>
-      </w:r>
-      <w:proofErr w:type="spellEnd"/>
-      <w:r>
-        <w:rPr>
-          <w:b/>
-          <w:sz w:val="26"/>
-        </w:rPr>
-        <w:t xml:space="preserve"> </w:t>
-      </w:r>
-      <w:proofErr w:type="spellStart"/>
-      <w:r>
-        <w:rPr>
-          <w:b/>
-          <w:sz w:val="26"/>
-        </w:rPr>
-        <w:t>Abduraahmaan</w:t>
-      </w:r>
-      <w:proofErr w:type="spellEnd"/>
+        <w:t>Hogganaa Dhaabbataa Abduraahmaan</w:t>
+      </w:r>
       <w:r>
         <w:rPr>
           <w:b/>
@@ -1253,8 +861,6 @@
           <w:sz w:val="2"/>
         </w:rPr>
       </w:pPr>
-      <w:bookmarkStart w:id="0" w:name="_GoBack"/>
-      <w:bookmarkEnd w:id="0"/>
     </w:p>
     <w:p>
       <w:pPr>
@@ -1323,21 +929,20 @@
         <w:rPr>
           <w:u w:val="single"/>
         </w:rPr>
-        <w:t xml:space="preserve"> {</w:t>
-      </w:r>
-      <w:proofErr w:type="spellStart"/>
-      <w:r>
-        <w:rPr>
+        <w:t xml:space="preserve"> </w:t>
+      </w:r>
+      <w:r>
+        <w:rPr>
+          <w:b/>
           <w:u w:val="single"/>
         </w:rPr>
-        <w:t>fullName</w:t>
-      </w:r>
-      <w:proofErr w:type="spellEnd"/>
+        <w:t>{fullName}</w:t>
+      </w:r>
       <w:r>
         <w:rPr>
           <w:u w:val="single"/>
         </w:rPr>
-        <w:t xml:space="preserve">} </w:t>
+        <w:t xml:space="preserve"> </w:t>
       </w:r>
       <w:r>
         <w:t xml:space="preserve"> Has accomplished a short term training program in the Occupational area Domestic work which can qualify him/her to UC-II From </w:t>
@@ -1346,21 +951,20 @@
         <w:rPr>
           <w:u w:val="single"/>
         </w:rPr>
-        <w:t xml:space="preserve"> {</w:t>
-      </w:r>
-      <w:proofErr w:type="spellStart"/>
-      <w:r>
-        <w:rPr>
+        <w:t xml:space="preserve"> </w:t>
+      </w:r>
+      <w:r>
+        <w:rPr>
+          <w:b/>
           <w:u w:val="single"/>
         </w:rPr>
-        <w:t>firstDate</w:t>
-      </w:r>
-      <w:proofErr w:type="spellEnd"/>
+        <w:t>{firstDate}</w:t>
+      </w:r>
       <w:r>
         <w:rPr>
           <w:u w:val="single"/>
         </w:rPr>
-        <w:t xml:space="preserve">} </w:t>
+        <w:t xml:space="preserve"> </w:t>
       </w:r>
       <w:r>
         <w:t xml:space="preserve">to </w:t>
@@ -1369,23 +973,20 @@
         <w:rPr>
           <w:u w:val="single"/>
         </w:rPr>
-        <w:t xml:space="preserve"> {</w:t>
-      </w:r>
-      <w:proofErr w:type="spellStart"/>
-      <w:proofErr w:type="gramStart"/>
-      <w:r>
-        <w:rPr>
+        <w:t xml:space="preserve"> </w:t>
+      </w:r>
+      <w:r>
+        <w:rPr>
+          <w:b/>
           <w:u w:val="single"/>
         </w:rPr>
-        <w:t>endDate</w:t>
-      </w:r>
-      <w:proofErr w:type="spellEnd"/>
-      <w:proofErr w:type="gramEnd"/>
+        <w:t>{endDate}</w:t>
+      </w:r>
       <w:r>
         <w:rPr>
           <w:u w:val="single"/>
         </w:rPr>
-        <w:t xml:space="preserve">} </w:t>
+        <w:t xml:space="preserve"> </w:t>
       </w:r>
       <w:r>
         <w:rPr>
@@ -1405,21 +1006,7 @@
         <w:rPr>
           <w:b/>
         </w:rPr>
-        <w:t>Note</w:t>
-      </w:r>
-      <w:proofErr w:type="gramStart"/>
-      <w:r>
-        <w:rPr>
-          <w:b/>
-        </w:rPr>
-        <w:t>:-</w:t>
-      </w:r>
-      <w:proofErr w:type="gramEnd"/>
-      <w:r>
-        <w:rPr>
-          <w:b/>
-        </w:rPr>
-        <w:t xml:space="preserve"> </w:t>
+        <w:t xml:space="preserve">Note:- </w:t>
       </w:r>
       <w:r>
         <w:t>This certificate I a training</w:t>
@@ -1518,33 +1105,8 @@
           <w:b/>
           <w:sz w:val="26"/>
         </w:rPr>
-        <w:t xml:space="preserve">Center </w:t>
-      </w:r>
-      <w:proofErr w:type="spellStart"/>
-      <w:r>
-        <w:rPr>
-          <w:b/>
-          <w:sz w:val="26"/>
-        </w:rPr>
-        <w:t>Abdurehman</w:t>
-      </w:r>
-      <w:proofErr w:type="spellEnd"/>
-      <w:r>
-        <w:rPr>
-          <w:b/>
-          <w:sz w:val="26"/>
-        </w:rPr>
-        <w:t xml:space="preserve"> </w:t>
-      </w:r>
-      <w:proofErr w:type="spellStart"/>
-      <w:r>
-        <w:rPr>
-          <w:b/>
-          <w:sz w:val="26"/>
-        </w:rPr>
-        <w:t>Jemal</w:t>
-      </w:r>
-      <w:proofErr w:type="spellEnd"/>
+        <w:t>Center Abdurehman Jemal</w:t>
+      </w:r>
     </w:p>
     <w:sectPr>
       <w:type w:val="continuous"/>

</xml_diff>